<commit_message>
notificaciones de entrada y salida añadidas al codigo, cambio en el word
</commit_message>
<xml_diff>
--- a/Especificación del Protocolo de Aplicación.docx
+++ b/Especificación del Protocolo de Aplicación.docx
@@ -432,10 +432,7 @@
         </w:numPr>
       </w:pPr>
       <w:r>
-        <w:t>Difusión (Servidor -&gt; Clientes): ROOM_BROADCAST|nombre_salon|usuario_emisor|fecha_hora|contenido_mensaj</w:t>
-      </w:r>
-      <w:r>
-        <w:t>e</w:t>
+        <w:t>Difusión (Servidor -&gt; Clientes): ROOM_BROADCAST|nombre_salon|usuario_emisor|fecha_hora|contenido_mensaje</w:t>
       </w:r>
     </w:p>
     <w:p/>
@@ -696,10 +693,7 @@
         <w:ind w:firstLine="360"/>
       </w:pPr>
       <w:r>
-        <w:t xml:space="preserve">-       </w:t>
-      </w:r>
-      <w:r>
-        <w:t xml:space="preserve">Notificación (Servidor -&gt; Clientes): </w:t>
+        <w:t xml:space="preserve">-       Notificación (Servidor -&gt; Clientes): </w:t>
       </w:r>
     </w:p>
     <w:p>
@@ -756,7 +750,7 @@
       </w:pPr>
       <w:r>
         <w:pict w14:anchorId="29DB7C8C">
-          <v:rect id="_x0000_i1055" style="width:0;height:1.5pt" o:hralign="center" o:hrstd="t" o:hr="t" fillcolor="#a0a0a0" stroked="f"/>
+          <v:rect id="_x0000_i1025" style="width:0;height:1.5pt" o:hralign="center" o:hrstd="t" o:hr="t" fillcolor="#a0a0a0" stroked="f"/>
         </w:pict>
       </w:r>
     </w:p>
@@ -898,6 +892,79 @@
       </w:pPr>
       <w:r>
         <w:t>Servidor: PONG</w:t>
+      </w:r>
+    </w:p>
+    <w:p/>
+    <w:p>
+      <w:r>
+        <w:t>SERIA CAMBIAR EL 4.2 ACTUAL POR ESTE</w:t>
+      </w:r>
+    </w:p>
+    <w:p>
+      <w:r>
+        <w:rPr>
+          <w:b/>
+          <w:bCs/>
+        </w:rPr>
+        <w:t>4.2. Notificaciones de Entrada y Salida</w:t>
+      </w:r>
+    </w:p>
+    <w:p>
+      <w:r>
+        <w:t xml:space="preserve">Cuando un usuario completa el </w:t>
+      </w:r>
+      <w:proofErr w:type="spellStart"/>
+      <w:r>
+        <w:t>login</w:t>
+      </w:r>
+      <w:proofErr w:type="spellEnd"/>
+      <w:r>
+        <w:t xml:space="preserve"> correctamente, el servidor emite automáticamente una notificación al resto de clientes autenticados. Del mismo modo, cuando un usuario se desconecta (por LOGOUT o pérdida de conexión), se emite una notificación de salida. No se notifica al propio usuario sobre su propia entrada.</w:t>
+      </w:r>
+    </w:p>
+    <w:p>
+      <w:pPr>
+        <w:numPr>
+          <w:ilvl w:val="0"/>
+          <w:numId w:val="8"/>
+        </w:numPr>
+      </w:pPr>
+      <w:r>
+        <w:t xml:space="preserve">Notificación de entrada (Servidor → resto de clientes): </w:t>
+      </w:r>
+      <w:proofErr w:type="spellStart"/>
+      <w:r>
+        <w:t>NOTIFY_JOIN|nombre_usuario</w:t>
+      </w:r>
+      <w:proofErr w:type="spellEnd"/>
+    </w:p>
+    <w:p>
+      <w:pPr>
+        <w:numPr>
+          <w:ilvl w:val="0"/>
+          <w:numId w:val="8"/>
+        </w:numPr>
+      </w:pPr>
+      <w:r>
+        <w:t xml:space="preserve">Notificación de salida (Servidor → resto de clientes): </w:t>
+      </w:r>
+      <w:proofErr w:type="spellStart"/>
+      <w:r>
+        <w:t>NOTIFY_LEAVE|nombre_usuario</w:t>
+      </w:r>
+      <w:proofErr w:type="spellEnd"/>
+    </w:p>
+    <w:p>
+      <w:r>
+        <w:t xml:space="preserve">En el cliente, la notificación de entrada se muestra tanto en el área de chat (&gt;&gt;&gt; usuario se ha conectado) como en un </w:t>
+      </w:r>
+      <w:proofErr w:type="spellStart"/>
+      <w:r>
+        <w:t>popup</w:t>
+      </w:r>
+      <w:proofErr w:type="spellEnd"/>
+      <w:r>
+        <w:t xml:space="preserve"> temporal no bloqueante que desaparece a los 3 segundos. La notificación de salida se muestra únicamente en el área de chat (&lt;&lt;&lt; usuario ha abandonado el chat).</w:t>
       </w:r>
     </w:p>
     <w:sectPr>
@@ -910,6 +977,56 @@
 </w:document>
 </file>
 
+<file path=word/endnotes.xml><?xml version="1.0" encoding="utf-8"?>
+<w:endnotes xmlns:wpc="http://schemas.microsoft.com/office/word/2010/wordprocessingCanvas" xmlns:cx="http://schemas.microsoft.com/office/drawing/2014/chartex" xmlns:cx1="http://schemas.microsoft.com/office/drawing/2015/9/8/chartex" xmlns:cx2="http://schemas.microsoft.com/office/drawing/2015/10/21/chartex" xmlns:cx3="http://schemas.microsoft.com/office/drawing/2016/5/9/chartex" xmlns:cx4="http://schemas.microsoft.com/office/drawing/2016/5/10/chartex" xmlns:cx5="http://schemas.microsoft.com/office/drawing/2016/5/11/chartex" xmlns:cx6="http://schemas.microsoft.com/office/drawing/2016/5/12/chartex" xmlns:cx7="http://schemas.microsoft.com/office/drawing/2016/5/13/chartex" xmlns:cx8="http://schemas.microsoft.com/office/drawing/2016/5/14/chartex" xmlns:mc="http://schemas.openxmlformats.org/markup-compatibility/2006" xmlns:aink="http://schemas.microsoft.com/office/drawing/2016/ink" xmlns:am3d="http://schemas.microsoft.com/office/drawing/2017/model3d" xmlns:o="urn:schemas-microsoft-com:office:office" xmlns:oel="http://schemas.microsoft.com/office/2019/extlst" xmlns:r="http://schemas.openxmlformats.org/officeDocument/2006/relationships" xmlns:m="http://schemas.openxmlformats.org/officeDocument/2006/math" xmlns:v="urn:schemas-microsoft-com:vml" xmlns:wp14="http://schemas.microsoft.com/office/word/2010/wordprocessingDrawing" xmlns:wp="http://schemas.openxmlformats.org/drawingml/2006/wordprocessingDrawing" xmlns:w10="urn:schemas-microsoft-com:office:word" xmlns:w="http://schemas.openxmlformats.org/wordprocessingml/2006/main" xmlns:w14="http://schemas.microsoft.com/office/word/2010/wordml" xmlns:w15="http://schemas.microsoft.com/office/word/2012/wordml" xmlns:w16cex="http://schemas.microsoft.com/office/word/2018/wordml/cex" xmlns:w16cid="http://schemas.microsoft.com/office/word/2016/wordml/cid" xmlns:w16="http://schemas.microsoft.com/office/word/2018/wordml" xmlns:w16du="http://schemas.microsoft.com/office/word/2023/wordml/word16du" xmlns:w16sdtdh="http://schemas.microsoft.com/office/word/2020/wordml/sdtdatahash" xmlns:w16sdtfl="http://schemas.microsoft.com/office/word/2024/wordml/sdtformatlock" xmlns:w16se="http://schemas.microsoft.com/office/word/2015/wordml/symex" xmlns:wpg="http://schemas.microsoft.com/office/word/2010/wordprocessingGroup" xmlns:wpi="http://schemas.microsoft.com/office/word/2010/wordprocessingInk" xmlns:wne="http://schemas.microsoft.com/office/word/2006/wordml" xmlns:wps="http://schemas.microsoft.com/office/word/2010/wordprocessingShape" mc:Ignorable="w14 w15 w16se w16cid w16 w16cex w16sdtdh w16sdtfl w16du wp14">
+  <w:endnote w:type="separator" w:id="-1">
+    <w:p>
+      <w:pPr>
+        <w:spacing w:after="0" w:line="240" w:lineRule="auto"/>
+      </w:pPr>
+      <w:r>
+        <w:separator/>
+      </w:r>
+    </w:p>
+  </w:endnote>
+  <w:endnote w:type="continuationSeparator" w:id="0">
+    <w:p>
+      <w:pPr>
+        <w:spacing w:after="0" w:line="240" w:lineRule="auto"/>
+      </w:pPr>
+      <w:r>
+        <w:continuationSeparator/>
+      </w:r>
+    </w:p>
+  </w:endnote>
+</w:endnotes>
+</file>
+
+<file path=word/footnotes.xml><?xml version="1.0" encoding="utf-8"?>
+<w:footnotes xmlns:wpc="http://schemas.microsoft.com/office/word/2010/wordprocessingCanvas" xmlns:cx="http://schemas.microsoft.com/office/drawing/2014/chartex" xmlns:cx1="http://schemas.microsoft.com/office/drawing/2015/9/8/chartex" xmlns:cx2="http://schemas.microsoft.com/office/drawing/2015/10/21/chartex" xmlns:cx3="http://schemas.microsoft.com/office/drawing/2016/5/9/chartex" xmlns:cx4="http://schemas.microsoft.com/office/drawing/2016/5/10/chartex" xmlns:cx5="http://schemas.microsoft.com/office/drawing/2016/5/11/chartex" xmlns:cx6="http://schemas.microsoft.com/office/drawing/2016/5/12/chartex" xmlns:cx7="http://schemas.microsoft.com/office/drawing/2016/5/13/chartex" xmlns:cx8="http://schemas.microsoft.com/office/drawing/2016/5/14/chartex" xmlns:mc="http://schemas.openxmlformats.org/markup-compatibility/2006" xmlns:aink="http://schemas.microsoft.com/office/drawing/2016/ink" xmlns:am3d="http://schemas.microsoft.com/office/drawing/2017/model3d" xmlns:o="urn:schemas-microsoft-com:office:office" xmlns:oel="http://schemas.microsoft.com/office/2019/extlst" xmlns:r="http://schemas.openxmlformats.org/officeDocument/2006/relationships" xmlns:m="http://schemas.openxmlformats.org/officeDocument/2006/math" xmlns:v="urn:schemas-microsoft-com:vml" xmlns:wp14="http://schemas.microsoft.com/office/word/2010/wordprocessingDrawing" xmlns:wp="http://schemas.openxmlformats.org/drawingml/2006/wordprocessingDrawing" xmlns:w10="urn:schemas-microsoft-com:office:word" xmlns:w="http://schemas.openxmlformats.org/wordprocessingml/2006/main" xmlns:w14="http://schemas.microsoft.com/office/word/2010/wordml" xmlns:w15="http://schemas.microsoft.com/office/word/2012/wordml" xmlns:w16cex="http://schemas.microsoft.com/office/word/2018/wordml/cex" xmlns:w16cid="http://schemas.microsoft.com/office/word/2016/wordml/cid" xmlns:w16="http://schemas.microsoft.com/office/word/2018/wordml" xmlns:w16du="http://schemas.microsoft.com/office/word/2023/wordml/word16du" xmlns:w16sdtdh="http://schemas.microsoft.com/office/word/2020/wordml/sdtdatahash" xmlns:w16sdtfl="http://schemas.microsoft.com/office/word/2024/wordml/sdtformatlock" xmlns:w16se="http://schemas.microsoft.com/office/word/2015/wordml/symex" xmlns:wpg="http://schemas.microsoft.com/office/word/2010/wordprocessingGroup" xmlns:wpi="http://schemas.microsoft.com/office/word/2010/wordprocessingInk" xmlns:wne="http://schemas.microsoft.com/office/word/2006/wordml" xmlns:wps="http://schemas.microsoft.com/office/word/2010/wordprocessingShape" mc:Ignorable="w14 w15 w16se w16cid w16 w16cex w16sdtdh w16sdtfl w16du wp14">
+  <w:footnote w:type="separator" w:id="-1">
+    <w:p>
+      <w:pPr>
+        <w:spacing w:after="0" w:line="240" w:lineRule="auto"/>
+      </w:pPr>
+      <w:r>
+        <w:separator/>
+      </w:r>
+    </w:p>
+  </w:footnote>
+  <w:footnote w:type="continuationSeparator" w:id="0">
+    <w:p>
+      <w:pPr>
+        <w:spacing w:after="0" w:line="240" w:lineRule="auto"/>
+      </w:pPr>
+      <w:r>
+        <w:continuationSeparator/>
+      </w:r>
+    </w:p>
+  </w:footnote>
+</w:footnotes>
+</file>
+
 <file path=word/numbering.xml><?xml version="1.0" encoding="utf-8"?>
 <w:numbering xmlns:wpc="http://schemas.microsoft.com/office/word/2010/wordprocessingCanvas" xmlns:cx="http://schemas.microsoft.com/office/drawing/2014/chartex" xmlns:cx1="http://schemas.microsoft.com/office/drawing/2015/9/8/chartex" xmlns:cx2="http://schemas.microsoft.com/office/drawing/2015/10/21/chartex" xmlns:cx3="http://schemas.microsoft.com/office/drawing/2016/5/9/chartex" xmlns:cx4="http://schemas.microsoft.com/office/drawing/2016/5/10/chartex" xmlns:cx5="http://schemas.microsoft.com/office/drawing/2016/5/11/chartex" xmlns:cx6="http://schemas.microsoft.com/office/drawing/2016/5/12/chartex" xmlns:cx7="http://schemas.microsoft.com/office/drawing/2016/5/13/chartex" xmlns:cx8="http://schemas.microsoft.com/office/drawing/2016/5/14/chartex" xmlns:mc="http://schemas.openxmlformats.org/markup-compatibility/2006" xmlns:aink="http://schemas.microsoft.com/office/drawing/2016/ink" xmlns:am3d="http://schemas.microsoft.com/office/drawing/2017/model3d" xmlns:o="urn:schemas-microsoft-com:office:office" xmlns:oel="http://schemas.microsoft.com/office/2019/extlst" xmlns:r="http://schemas.openxmlformats.org/officeDocument/2006/relationships" xmlns:m="http://schemas.openxmlformats.org/officeDocument/2006/math" xmlns:v="urn:schemas-microsoft-com:vml" xmlns:wp14="http://schemas.microsoft.com/office/word/2010/wordprocessingDrawing" xmlns:wp="http://schemas.openxmlformats.org/drawingml/2006/wordprocessingDrawing" xmlns:w10="urn:schemas-microsoft-com:office:word" xmlns:w="http://schemas.openxmlformats.org/wordprocessingml/2006/main" xmlns:w14="http://schemas.microsoft.com/office/word/2010/wordml" xmlns:w15="http://schemas.microsoft.com/office/word/2012/wordml" xmlns:w16cex="http://schemas.microsoft.com/office/word/2018/wordml/cex" xmlns:w16cid="http://schemas.microsoft.com/office/word/2016/wordml/cid" xmlns:w16="http://schemas.microsoft.com/office/word/2018/wordml" xmlns:w16du="http://schemas.microsoft.com/office/word/2023/wordml/word16du" xmlns:w16sdtdh="http://schemas.microsoft.com/office/word/2020/wordml/sdtdatahash" xmlns:w16sdtfl="http://schemas.microsoft.com/office/word/2024/wordml/sdtformatlock" xmlns:w16se="http://schemas.microsoft.com/office/word/2015/wordml/symex" xmlns:wpg="http://schemas.microsoft.com/office/word/2010/wordprocessingGroup" xmlns:wpi="http://schemas.microsoft.com/office/word/2010/wordprocessingInk" xmlns:wne="http://schemas.microsoft.com/office/word/2006/wordml" xmlns:wps="http://schemas.microsoft.com/office/word/2010/wordprocessingShape" mc:Ignorable="w14 w15 w16se w16cid w16 w16cex w16sdtdh w16sdtfl w16du wp14">
   <w:abstractNum w:abstractNumId="0" w15:restartNumberingAfterBreak="0">
@@ -1415,6 +1532,155 @@
     </w:lvl>
   </w:abstractNum>
   <w:abstractNum w:abstractNumId="4" w15:restartNumberingAfterBreak="0">
+    <w:nsid w:val="4CCF7914"/>
+    <w:multiLevelType w:val="multilevel"/>
+    <w:tmpl w:val="6E9E2EFE"/>
+    <w:lvl w:ilvl="0">
+      <w:start w:val="1"/>
+      <w:numFmt w:val="bullet"/>
+      <w:lvlText w:val=""/>
+      <w:lvlJc w:val="left"/>
+      <w:pPr>
+        <w:tabs>
+          <w:tab w:val="num" w:pos="720"/>
+        </w:tabs>
+        <w:ind w:left="720" w:hanging="360"/>
+      </w:pPr>
+      <w:rPr>
+        <w:rFonts w:ascii="Symbol" w:hAnsi="Symbol" w:hint="default"/>
+        <w:sz w:val="20"/>
+      </w:rPr>
+    </w:lvl>
+    <w:lvl w:ilvl="1" w:tentative="1">
+      <w:start w:val="1"/>
+      <w:numFmt w:val="bullet"/>
+      <w:lvlText w:val="o"/>
+      <w:lvlJc w:val="left"/>
+      <w:pPr>
+        <w:tabs>
+          <w:tab w:val="num" w:pos="1440"/>
+        </w:tabs>
+        <w:ind w:left="1440" w:hanging="360"/>
+      </w:pPr>
+      <w:rPr>
+        <w:rFonts w:ascii="Courier New" w:hAnsi="Courier New" w:hint="default"/>
+        <w:sz w:val="20"/>
+      </w:rPr>
+    </w:lvl>
+    <w:lvl w:ilvl="2" w:tentative="1">
+      <w:start w:val="1"/>
+      <w:numFmt w:val="bullet"/>
+      <w:lvlText w:val=""/>
+      <w:lvlJc w:val="left"/>
+      <w:pPr>
+        <w:tabs>
+          <w:tab w:val="num" w:pos="2160"/>
+        </w:tabs>
+        <w:ind w:left="2160" w:hanging="360"/>
+      </w:pPr>
+      <w:rPr>
+        <w:rFonts w:ascii="Wingdings" w:hAnsi="Wingdings" w:hint="default"/>
+        <w:sz w:val="20"/>
+      </w:rPr>
+    </w:lvl>
+    <w:lvl w:ilvl="3" w:tentative="1">
+      <w:start w:val="1"/>
+      <w:numFmt w:val="bullet"/>
+      <w:lvlText w:val=""/>
+      <w:lvlJc w:val="left"/>
+      <w:pPr>
+        <w:tabs>
+          <w:tab w:val="num" w:pos="2880"/>
+        </w:tabs>
+        <w:ind w:left="2880" w:hanging="360"/>
+      </w:pPr>
+      <w:rPr>
+        <w:rFonts w:ascii="Wingdings" w:hAnsi="Wingdings" w:hint="default"/>
+        <w:sz w:val="20"/>
+      </w:rPr>
+    </w:lvl>
+    <w:lvl w:ilvl="4" w:tentative="1">
+      <w:start w:val="1"/>
+      <w:numFmt w:val="bullet"/>
+      <w:lvlText w:val=""/>
+      <w:lvlJc w:val="left"/>
+      <w:pPr>
+        <w:tabs>
+          <w:tab w:val="num" w:pos="3600"/>
+        </w:tabs>
+        <w:ind w:left="3600" w:hanging="360"/>
+      </w:pPr>
+      <w:rPr>
+        <w:rFonts w:ascii="Wingdings" w:hAnsi="Wingdings" w:hint="default"/>
+        <w:sz w:val="20"/>
+      </w:rPr>
+    </w:lvl>
+    <w:lvl w:ilvl="5" w:tentative="1">
+      <w:start w:val="1"/>
+      <w:numFmt w:val="bullet"/>
+      <w:lvlText w:val=""/>
+      <w:lvlJc w:val="left"/>
+      <w:pPr>
+        <w:tabs>
+          <w:tab w:val="num" w:pos="4320"/>
+        </w:tabs>
+        <w:ind w:left="4320" w:hanging="360"/>
+      </w:pPr>
+      <w:rPr>
+        <w:rFonts w:ascii="Wingdings" w:hAnsi="Wingdings" w:hint="default"/>
+        <w:sz w:val="20"/>
+      </w:rPr>
+    </w:lvl>
+    <w:lvl w:ilvl="6" w:tentative="1">
+      <w:start w:val="1"/>
+      <w:numFmt w:val="bullet"/>
+      <w:lvlText w:val=""/>
+      <w:lvlJc w:val="left"/>
+      <w:pPr>
+        <w:tabs>
+          <w:tab w:val="num" w:pos="5040"/>
+        </w:tabs>
+        <w:ind w:left="5040" w:hanging="360"/>
+      </w:pPr>
+      <w:rPr>
+        <w:rFonts w:ascii="Wingdings" w:hAnsi="Wingdings" w:hint="default"/>
+        <w:sz w:val="20"/>
+      </w:rPr>
+    </w:lvl>
+    <w:lvl w:ilvl="7" w:tentative="1">
+      <w:start w:val="1"/>
+      <w:numFmt w:val="bullet"/>
+      <w:lvlText w:val=""/>
+      <w:lvlJc w:val="left"/>
+      <w:pPr>
+        <w:tabs>
+          <w:tab w:val="num" w:pos="5760"/>
+        </w:tabs>
+        <w:ind w:left="5760" w:hanging="360"/>
+      </w:pPr>
+      <w:rPr>
+        <w:rFonts w:ascii="Wingdings" w:hAnsi="Wingdings" w:hint="default"/>
+        <w:sz w:val="20"/>
+      </w:rPr>
+    </w:lvl>
+    <w:lvl w:ilvl="8" w:tentative="1">
+      <w:start w:val="1"/>
+      <w:numFmt w:val="bullet"/>
+      <w:lvlText w:val=""/>
+      <w:lvlJc w:val="left"/>
+      <w:pPr>
+        <w:tabs>
+          <w:tab w:val="num" w:pos="6480"/>
+        </w:tabs>
+        <w:ind w:left="6480" w:hanging="360"/>
+      </w:pPr>
+      <w:rPr>
+        <w:rFonts w:ascii="Wingdings" w:hAnsi="Wingdings" w:hint="default"/>
+        <w:sz w:val="20"/>
+      </w:rPr>
+    </w:lvl>
+  </w:abstractNum>
+  <w:abstractNum w:abstractNumId="5" w15:restartNumberingAfterBreak="0">
     <w:nsid w:val="4DF74E75"/>
     <w:multiLevelType w:val="multilevel"/>
     <w:tmpl w:val="6BAADD10"/>
@@ -1563,7 +1829,7 @@
       </w:rPr>
     </w:lvl>
   </w:abstractNum>
-  <w:abstractNum w:abstractNumId="5" w15:restartNumberingAfterBreak="0">
+  <w:abstractNum w:abstractNumId="6" w15:restartNumberingAfterBreak="0">
     <w:nsid w:val="73E26A1D"/>
     <w:multiLevelType w:val="hybridMultilevel"/>
     <w:tmpl w:val="9050CFEA"/>
@@ -1676,7 +1942,7 @@
       </w:rPr>
     </w:lvl>
   </w:abstractNum>
-  <w:abstractNum w:abstractNumId="6" w15:restartNumberingAfterBreak="0">
+  <w:abstractNum w:abstractNumId="7" w15:restartNumberingAfterBreak="0">
     <w:nsid w:val="7DF43DCE"/>
     <w:multiLevelType w:val="hybridMultilevel"/>
     <w:tmpl w:val="488807A6"/>
@@ -1771,13 +2037,13 @@
     <w:abstractNumId w:val="1"/>
   </w:num>
   <w:num w:numId="2" w16cid:durableId="1274046516">
+    <w:abstractNumId w:val="7"/>
+  </w:num>
+  <w:num w:numId="3" w16cid:durableId="1919778331">
     <w:abstractNumId w:val="6"/>
   </w:num>
-  <w:num w:numId="3" w16cid:durableId="1919778331">
+  <w:num w:numId="4" w16cid:durableId="429156343">
     <w:abstractNumId w:val="5"/>
-  </w:num>
-  <w:num w:numId="4" w16cid:durableId="429156343">
-    <w:abstractNumId w:val="4"/>
   </w:num>
   <w:num w:numId="5" w16cid:durableId="1631594896">
     <w:abstractNumId w:val="2"/>
@@ -1787,6 +2053,9 @@
   </w:num>
   <w:num w:numId="7" w16cid:durableId="849491645">
     <w:abstractNumId w:val="3"/>
+  </w:num>
+  <w:num w:numId="8" w16cid:durableId="661473618">
+    <w:abstractNumId w:val="4"/>
   </w:num>
 </w:numbering>
 </file>
@@ -2707,6 +2976,50 @@
       <w:spacing w:val="5"/>
     </w:rPr>
   </w:style>
+  <w:style w:type="paragraph" w:styleId="Encabezado">
+    <w:name w:val="header"/>
+    <w:basedOn w:val="Normal"/>
+    <w:link w:val="EncabezadoCar"/>
+    <w:uiPriority w:val="99"/>
+    <w:unhideWhenUsed/>
+    <w:rsid w:val="00721A3C"/>
+    <w:pPr>
+      <w:tabs>
+        <w:tab w:val="center" w:pos="4252"/>
+        <w:tab w:val="right" w:pos="8504"/>
+      </w:tabs>
+      <w:spacing w:after="0" w:line="240" w:lineRule="auto"/>
+    </w:pPr>
+  </w:style>
+  <w:style w:type="character" w:customStyle="1" w:styleId="EncabezadoCar">
+    <w:name w:val="Encabezado Car"/>
+    <w:basedOn w:val="Fuentedeprrafopredeter"/>
+    <w:link w:val="Encabezado"/>
+    <w:uiPriority w:val="99"/>
+    <w:rsid w:val="00721A3C"/>
+  </w:style>
+  <w:style w:type="paragraph" w:styleId="Piedepgina">
+    <w:name w:val="footer"/>
+    <w:basedOn w:val="Normal"/>
+    <w:link w:val="PiedepginaCar"/>
+    <w:uiPriority w:val="99"/>
+    <w:unhideWhenUsed/>
+    <w:rsid w:val="00721A3C"/>
+    <w:pPr>
+      <w:tabs>
+        <w:tab w:val="center" w:pos="4252"/>
+        <w:tab w:val="right" w:pos="8504"/>
+      </w:tabs>
+      <w:spacing w:after="0" w:line="240" w:lineRule="auto"/>
+    </w:pPr>
+  </w:style>
+  <w:style w:type="character" w:customStyle="1" w:styleId="PiedepginaCar">
+    <w:name w:val="Pie de página Car"/>
+    <w:basedOn w:val="Fuentedeprrafopredeter"/>
+    <w:link w:val="Piedepgina"/>
+    <w:uiPriority w:val="99"/>
+    <w:rsid w:val="00721A3C"/>
+  </w:style>
 </w:styles>
 </file>
 

</xml_diff>

<commit_message>
Nueva funcionalidad , cambio en la interfaz y protoclo finalizado
Añadida la funcionalidad de Mensajes privados a la que se le añade una pestaña nueva de la interfaz
La interfaz ha mejorado siendo mas optima
Protocolo finalizado
</commit_message>
<xml_diff>
--- a/Especificación del Protocolo de Aplicación.docx
+++ b/Especificación del Protocolo de Aplicación.docx
@@ -666,47 +666,70 @@
       </w:r>
     </w:p>
     <w:p>
-      <w:pPr>
-        <w:rPr>
-          <w:b/>
-          <w:bCs/>
-        </w:rPr>
-      </w:pPr>
-      <w:r>
-        <w:rPr>
-          <w:b/>
-          <w:bCs/>
-        </w:rPr>
-        <w:t>4.2. Notificaciones de Entrada</w:t>
-      </w:r>
-    </w:p>
-    <w:p>
-      <w:pPr>
-        <w:ind w:left="360"/>
-      </w:pPr>
-      <w:r>
-        <w:t>Aviso automático cuando un usuario nuevo entra en un salón.</w:t>
-      </w:r>
-    </w:p>
-    <w:p>
-      <w:pPr>
-        <w:ind w:firstLine="360"/>
-      </w:pPr>
-      <w:r>
-        <w:t xml:space="preserve">-       Notificación (Servidor -&gt; Clientes): </w:t>
-      </w:r>
-    </w:p>
-    <w:p>
-      <w:pPr>
-        <w:ind w:firstLine="708"/>
-      </w:pPr>
+      <w:r>
+        <w:rPr>
+          <w:b/>
+          <w:bCs/>
+        </w:rPr>
+        <w:t>4.2. Notificaciones de Entrada y Salida</w:t>
+      </w:r>
+    </w:p>
+    <w:p>
+      <w:r>
+        <w:t xml:space="preserve">Cuando un usuario completa el </w:t>
+      </w:r>
       <w:proofErr w:type="spellStart"/>
       <w:r>
-        <w:t>NOTIFY_JOIN|nombre_salon|nombre_usuario</w:t>
+        <w:t>login</w:t>
       </w:r>
       <w:proofErr w:type="spellEnd"/>
       <w:r>
-        <w:t xml:space="preserve"> </w:t>
+        <w:t xml:space="preserve"> correctamente, el servidor emite automáticamente una notificación al resto de clientes autenticados. Del mismo modo, cuando un usuario se desconecta (por LOGOUT o pérdida de conexión), se emite una notificación de salida. No se notifica al propio usuario sobre su propia entrada.</w:t>
+      </w:r>
+    </w:p>
+    <w:p>
+      <w:pPr>
+        <w:numPr>
+          <w:ilvl w:val="0"/>
+          <w:numId w:val="8"/>
+        </w:numPr>
+      </w:pPr>
+      <w:r>
+        <w:t xml:space="preserve">Notificación de entrada (Servidor → resto de clientes): </w:t>
+      </w:r>
+      <w:proofErr w:type="spellStart"/>
+      <w:r>
+        <w:t>NOTIFY_JOIN|nombre_usuario</w:t>
+      </w:r>
+      <w:proofErr w:type="spellEnd"/>
+    </w:p>
+    <w:p>
+      <w:pPr>
+        <w:numPr>
+          <w:ilvl w:val="0"/>
+          <w:numId w:val="8"/>
+        </w:numPr>
+      </w:pPr>
+      <w:r>
+        <w:t xml:space="preserve">Notificación de salida (Servidor → resto de clientes): </w:t>
+      </w:r>
+      <w:proofErr w:type="spellStart"/>
+      <w:r>
+        <w:t>NOTIFY_LEAVE|nombre_usuario</w:t>
+      </w:r>
+      <w:proofErr w:type="spellEnd"/>
+    </w:p>
+    <w:p>
+      <w:r>
+        <w:t xml:space="preserve">En el cliente, la notificación de entrada se muestra tanto en el área de chat (&gt;&gt;&gt; usuario se ha conectado) como en un </w:t>
+      </w:r>
+      <w:proofErr w:type="spellStart"/>
+      <w:r>
+        <w:t>popup</w:t>
+      </w:r>
+      <w:proofErr w:type="spellEnd"/>
+      <w:r>
+        <w:t xml:space="preserve"> temporal no bloqueante que desaparece a los 3 segundos. La notificación de salida se muestra únicamente en el área de chat (&lt;&lt;&lt; usuario ha abandonado el chat).</w:t>
       </w:r>
     </w:p>
     <w:p>
@@ -747,226 +770,12 @@
     <w:p>
       <w:pPr>
         <w:ind w:left="360"/>
-      </w:pPr>
-      <w:r>
-        <w:pict w14:anchorId="29DB7C8C">
-          <v:rect id="_x0000_i1025" style="width:0;height:1.5pt" o:hralign="center" o:hrstd="t" o:hr="t" fillcolor="#a0a0a0" stroked="f"/>
-        </w:pict>
-      </w:r>
-    </w:p>
-    <w:p>
-      <w:pPr>
-        <w:rPr>
-          <w:b/>
-          <w:bCs/>
-        </w:rPr>
-      </w:pPr>
-      <w:r>
-        <w:rPr>
-          <w:b/>
-          <w:bCs/>
-        </w:rPr>
-        <w:t>5. Ejemplo de Flujo de Comunicación (Caso de Éxito)</w:t>
-      </w:r>
-    </w:p>
-    <w:p>
-      <w:pPr>
-        <w:numPr>
-          <w:ilvl w:val="0"/>
-          <w:numId w:val="7"/>
-        </w:numPr>
-      </w:pPr>
-      <w:r>
-        <w:t xml:space="preserve">Cliente: </w:t>
-      </w:r>
-      <w:proofErr w:type="spellStart"/>
-      <w:r>
-        <w:t>REG|Juan</w:t>
-      </w:r>
-      <w:proofErr w:type="spellEnd"/>
-    </w:p>
-    <w:p>
-      <w:pPr>
-        <w:numPr>
-          <w:ilvl w:val="0"/>
-          <w:numId w:val="7"/>
-        </w:numPr>
-      </w:pPr>
-      <w:r>
-        <w:t xml:space="preserve">Servidor: REG_OK|101 (Juan ya tiene su clave única) </w:t>
-      </w:r>
-    </w:p>
-    <w:p>
-      <w:pPr>
-        <w:numPr>
-          <w:ilvl w:val="0"/>
-          <w:numId w:val="7"/>
-        </w:numPr>
-      </w:pPr>
-      <w:r>
-        <w:t>Cliente: LOGIN|Juan|101</w:t>
-      </w:r>
-    </w:p>
-    <w:p>
-      <w:pPr>
-        <w:numPr>
-          <w:ilvl w:val="0"/>
-          <w:numId w:val="7"/>
-        </w:numPr>
-      </w:pPr>
-      <w:r>
-        <w:t xml:space="preserve">Servidor: </w:t>
-      </w:r>
-      <w:proofErr w:type="spellStart"/>
-      <w:r>
-        <w:t>LOGIN_OK|</w:t>
-      </w:r>
-      <w:proofErr w:type="gramStart"/>
-      <w:r>
-        <w:t>IA,Deportes</w:t>
-      </w:r>
-      <w:proofErr w:type="gramEnd"/>
-      <w:r>
-        <w:t>,</w:t>
-      </w:r>
-      <w:proofErr w:type="gramStart"/>
-      <w:r>
-        <w:t>Therian,Manga</w:t>
-      </w:r>
-      <w:proofErr w:type="gramEnd"/>
-      <w:r>
-        <w:t>,UEMO</w:t>
-      </w:r>
-      <w:proofErr w:type="spellEnd"/>
-      <w:r>
-        <w:t xml:space="preserve"> </w:t>
-      </w:r>
-    </w:p>
-    <w:p>
-      <w:pPr>
-        <w:numPr>
-          <w:ilvl w:val="0"/>
-          <w:numId w:val="7"/>
-        </w:numPr>
-      </w:pPr>
-      <w:r>
-        <w:t xml:space="preserve">Cliente: </w:t>
-      </w:r>
-      <w:proofErr w:type="spellStart"/>
-      <w:r>
-        <w:t>MSG_ROOM|IA|Hola</w:t>
-      </w:r>
-      <w:proofErr w:type="spellEnd"/>
-      <w:r>
-        <w:t xml:space="preserve"> a todos </w:t>
-      </w:r>
-    </w:p>
-    <w:p>
-      <w:pPr>
-        <w:numPr>
-          <w:ilvl w:val="0"/>
-          <w:numId w:val="7"/>
-        </w:numPr>
-      </w:pPr>
-      <w:r>
-        <w:t xml:space="preserve">Servidor (a todos): ROOM_BROADCAST|IA|Juan|2026-05-04 12:00|Hola a todos </w:t>
-      </w:r>
-    </w:p>
-    <w:p>
-      <w:pPr>
-        <w:numPr>
-          <w:ilvl w:val="0"/>
-          <w:numId w:val="7"/>
-        </w:numPr>
-      </w:pPr>
-      <w:r>
-        <w:t xml:space="preserve">Cliente: PING </w:t>
-      </w:r>
-    </w:p>
-    <w:p>
-      <w:pPr>
-        <w:numPr>
-          <w:ilvl w:val="0"/>
-          <w:numId w:val="7"/>
-        </w:numPr>
-      </w:pPr>
-      <w:r>
-        <w:t>Servidor: PONG</w:t>
-      </w:r>
+        <w:rPr>
+          <w:u w:val="single"/>
+        </w:rPr>
+      </w:pPr>
     </w:p>
     <w:p/>
-    <w:p>
-      <w:r>
-        <w:t>SERIA CAMBIAR EL 4.2 ACTUAL POR ESTE</w:t>
-      </w:r>
-    </w:p>
-    <w:p>
-      <w:r>
-        <w:rPr>
-          <w:b/>
-          <w:bCs/>
-        </w:rPr>
-        <w:t>4.2. Notificaciones de Entrada y Salida</w:t>
-      </w:r>
-    </w:p>
-    <w:p>
-      <w:r>
-        <w:t xml:space="preserve">Cuando un usuario completa el </w:t>
-      </w:r>
-      <w:proofErr w:type="spellStart"/>
-      <w:r>
-        <w:t>login</w:t>
-      </w:r>
-      <w:proofErr w:type="spellEnd"/>
-      <w:r>
-        <w:t xml:space="preserve"> correctamente, el servidor emite automáticamente una notificación al resto de clientes autenticados. Del mismo modo, cuando un usuario se desconecta (por LOGOUT o pérdida de conexión), se emite una notificación de salida. No se notifica al propio usuario sobre su propia entrada.</w:t>
-      </w:r>
-    </w:p>
-    <w:p>
-      <w:pPr>
-        <w:numPr>
-          <w:ilvl w:val="0"/>
-          <w:numId w:val="8"/>
-        </w:numPr>
-      </w:pPr>
-      <w:r>
-        <w:t xml:space="preserve">Notificación de entrada (Servidor → resto de clientes): </w:t>
-      </w:r>
-      <w:proofErr w:type="spellStart"/>
-      <w:r>
-        <w:t>NOTIFY_JOIN|nombre_usuario</w:t>
-      </w:r>
-      <w:proofErr w:type="spellEnd"/>
-    </w:p>
-    <w:p>
-      <w:pPr>
-        <w:numPr>
-          <w:ilvl w:val="0"/>
-          <w:numId w:val="8"/>
-        </w:numPr>
-      </w:pPr>
-      <w:r>
-        <w:t xml:space="preserve">Notificación de salida (Servidor → resto de clientes): </w:t>
-      </w:r>
-      <w:proofErr w:type="spellStart"/>
-      <w:r>
-        <w:t>NOTIFY_LEAVE|nombre_usuario</w:t>
-      </w:r>
-      <w:proofErr w:type="spellEnd"/>
-    </w:p>
-    <w:p>
-      <w:r>
-        <w:t xml:space="preserve">En el cliente, la notificación de entrada se muestra tanto en el área de chat (&gt;&gt;&gt; usuario se ha conectado) como en un </w:t>
-      </w:r>
-      <w:proofErr w:type="spellStart"/>
-      <w:r>
-        <w:t>popup</w:t>
-      </w:r>
-      <w:proofErr w:type="spellEnd"/>
-      <w:r>
-        <w:t xml:space="preserve"> temporal no bloqueante que desaparece a los 3 segundos. La notificación de salida se muestra únicamente en el área de chat (&lt;&lt;&lt; usuario ha abandonado el chat).</w:t>
-      </w:r>
-    </w:p>
     <w:sectPr>
       <w:pgSz w:w="11906" w:h="16838"/>
       <w:pgMar w:top="1417" w:right="1701" w:bottom="1417" w:left="1701" w:header="708" w:footer="708" w:gutter="0"/>
@@ -2460,6 +2269,7 @@
   <w:style w:type="paragraph" w:default="1" w:styleId="Normal">
     <w:name w:val="Normal"/>
     <w:qFormat/>
+    <w:rsid w:val="009602AA"/>
   </w:style>
   <w:style w:type="paragraph" w:styleId="Ttulo1">
     <w:name w:val="heading 1"/>
@@ -2663,6 +2473,7 @@
   <w:style w:type="character" w:default="1" w:styleId="Fuentedeprrafopredeter">
     <w:name w:val="Default Paragraph Font"/>
     <w:uiPriority w:val="1"/>
+    <w:semiHidden/>
     <w:unhideWhenUsed/>
   </w:style>
   <w:style w:type="table" w:default="1" w:styleId="Tablanormal">

</xml_diff>